<commit_message>
added python 3.12 setup instruction
</commit_message>
<xml_diff>
--- a/project_documents/setup/env setup guide.docx
+++ b/project_documents/setup/env setup guide.docx
@@ -96,7 +96,15 @@
         <w:t>,</w:t>
       </w:r>
       <w:r>
-        <w:t xml:space="preserve"> it will install wsl along with default ubuntu</w:t>
+        <w:t xml:space="preserve"> it will install </w:t>
+      </w:r>
+      <w:proofErr w:type="spellStart"/>
+      <w:r>
+        <w:t>wsl</w:t>
+      </w:r>
+      <w:proofErr w:type="spellEnd"/>
+      <w:r>
+        <w:t xml:space="preserve"> along with default ubuntu</w:t>
       </w:r>
     </w:p>
     <w:p>
@@ -108,11 +116,24 @@
         </w:numPr>
         <w:ind w:left="1800"/>
       </w:pPr>
-      <w:r>
-        <w:t>wsl -l -v</w:t>
-      </w:r>
-      <w:r>
-        <w:t xml:space="preserve"> , whether wsl2 installed or not.</w:t>
+      <w:proofErr w:type="spellStart"/>
+      <w:r>
+        <w:t>wsl</w:t>
+      </w:r>
+      <w:proofErr w:type="spellEnd"/>
+      <w:r>
+        <w:t xml:space="preserve"> -l -</w:t>
+      </w:r>
+      <w:proofErr w:type="gramStart"/>
+      <w:r>
+        <w:t>v</w:t>
+      </w:r>
+      <w:r>
+        <w:t xml:space="preserve"> ,</w:t>
+      </w:r>
+      <w:proofErr w:type="gramEnd"/>
+      <w:r>
+        <w:t xml:space="preserve"> whether wsl2 installed or not.</w:t>
       </w:r>
     </w:p>
     <w:p>
@@ -125,13 +146,34 @@
         <w:ind w:left="1800"/>
       </w:pPr>
       <w:r>
-        <w:t xml:space="preserve">in Ubuntu Terminal  : </w:t>
-      </w:r>
-      <w:r>
-        <w:t>lsb_release -a</w:t>
-      </w:r>
-      <w:r>
-        <w:t xml:space="preserve">  , details which Ubuntu version is running.</w:t>
+        <w:t xml:space="preserve">in Ubuntu </w:t>
+      </w:r>
+      <w:proofErr w:type="gramStart"/>
+      <w:r>
+        <w:t>Terminal  :</w:t>
+      </w:r>
+      <w:proofErr w:type="gramEnd"/>
+      <w:r>
+        <w:t xml:space="preserve"> </w:t>
+      </w:r>
+      <w:proofErr w:type="spellStart"/>
+      <w:r>
+        <w:t>lsb_release</w:t>
+      </w:r>
+      <w:proofErr w:type="spellEnd"/>
+      <w:r>
+        <w:t xml:space="preserve"> -</w:t>
+      </w:r>
+      <w:proofErr w:type="gramStart"/>
+      <w:r>
+        <w:t>a</w:t>
+      </w:r>
+      <w:r>
+        <w:t xml:space="preserve">  ,</w:t>
+      </w:r>
+      <w:proofErr w:type="gramEnd"/>
+      <w:r>
+        <w:t xml:space="preserve"> details which Ubuntu version is running.</w:t>
       </w:r>
     </w:p>
     <w:p>
@@ -179,9 +221,11 @@
       <w:r>
         <w:t xml:space="preserve"> + </w:t>
       </w:r>
+      <w:proofErr w:type="spellStart"/>
       <w:r>
         <w:t>uv</w:t>
       </w:r>
+      <w:proofErr w:type="spellEnd"/>
       <w:r>
         <w:t xml:space="preserve"> </w:t>
       </w:r>
@@ -195,7 +239,7 @@
         </w:numPr>
       </w:pPr>
       <w:r>
-        <w:t>curl -LsSf https://astral.sh/uv/install.sh | sh</w:t>
+        <w:t>3.14 will be globally, so once create virtual env install 3.12 inside virtual environment</w:t>
       </w:r>
     </w:p>
     <w:p>
@@ -207,8 +251,21 @@
         </w:numPr>
       </w:pPr>
       <w:r>
-        <w:t>source ~/.bashrc</w:t>
-      </w:r>
+        <w:t>curl -</w:t>
+      </w:r>
+      <w:proofErr w:type="spellStart"/>
+      <w:r>
+        <w:t>LsSf</w:t>
+      </w:r>
+      <w:proofErr w:type="spellEnd"/>
+      <w:r>
+        <w:t xml:space="preserve"> https://astral.sh/uv/install.sh | </w:t>
+      </w:r>
+      <w:proofErr w:type="spellStart"/>
+      <w:r>
+        <w:t>sh</w:t>
+      </w:r>
+      <w:proofErr w:type="spellEnd"/>
     </w:p>
     <w:p>
       <w:pPr>
@@ -219,7 +276,34 @@
         </w:numPr>
       </w:pPr>
       <w:r>
-        <w:t xml:space="preserve">uv </w:t>
+        <w:t>source ~</w:t>
+      </w:r>
+      <w:proofErr w:type="gramStart"/>
+      <w:r>
+        <w:t>/.</w:t>
+      </w:r>
+      <w:proofErr w:type="spellStart"/>
+      <w:r>
+        <w:t>bashrc</w:t>
+      </w:r>
+      <w:proofErr w:type="spellEnd"/>
+      <w:proofErr w:type="gramEnd"/>
+    </w:p>
+    <w:p>
+      <w:pPr>
+        <w:pStyle w:val="ListParagraph"/>
+        <w:numPr>
+          <w:ilvl w:val="1"/>
+          <w:numId w:val="3"/>
+        </w:numPr>
+      </w:pPr>
+      <w:proofErr w:type="spellStart"/>
+      <w:r>
+        <w:t>uv</w:t>
+      </w:r>
+      <w:proofErr w:type="spellEnd"/>
+      <w:r>
+        <w:t xml:space="preserve"> </w:t>
       </w:r>
       <w:r>
         <w:t>–</w:t>
@@ -241,17 +325,37 @@
         <w:pStyle w:val="ListParagraph"/>
         <w:ind w:left="1440"/>
       </w:pPr>
-      <w:r>
-        <w:t>uv venv</w:t>
-      </w:r>
+      <w:proofErr w:type="spellStart"/>
+      <w:r>
+        <w:t>uv</w:t>
+      </w:r>
+      <w:proofErr w:type="spellEnd"/>
+      <w:r>
+        <w:t xml:space="preserve"> </w:t>
+      </w:r>
+      <w:proofErr w:type="spellStart"/>
+      <w:r>
+        <w:t>venv</w:t>
+      </w:r>
+      <w:proofErr w:type="spellEnd"/>
     </w:p>
     <w:p>
       <w:pPr>
         <w:pStyle w:val="ListParagraph"/>
         <w:ind w:left="1440"/>
       </w:pPr>
-      <w:r>
-        <w:t>source .venv/bin/activate</w:t>
+      <w:proofErr w:type="gramStart"/>
+      <w:r>
+        <w:t>source .</w:t>
+      </w:r>
+      <w:proofErr w:type="spellStart"/>
+      <w:r>
+        <w:t>venv</w:t>
+      </w:r>
+      <w:proofErr w:type="spellEnd"/>
+      <w:proofErr w:type="gramEnd"/>
+      <w:r>
+        <w:t>/bin/activate</w:t>
       </w:r>
     </w:p>
     <w:p>
@@ -267,8 +371,13 @@
       <w:pPr>
         <w:ind w:firstLine="720"/>
       </w:pPr>
-      <w:r>
-        <w:t>sudo apt install openjdk-17-jdk -y</w:t>
+      <w:proofErr w:type="spellStart"/>
+      <w:r>
+        <w:t>sudo</w:t>
+      </w:r>
+      <w:proofErr w:type="spellEnd"/>
+      <w:r>
+        <w:t xml:space="preserve"> apt install openjdk-17-jdk -y</w:t>
       </w:r>
     </w:p>
     <w:p>
@@ -300,8 +409,13 @@
         </w:numPr>
         <w:ind w:left="1080"/>
       </w:pPr>
-      <w:r>
-        <w:t>mkdir -p ~/</w:t>
+      <w:proofErr w:type="spellStart"/>
+      <w:r>
+        <w:t>mkdir</w:t>
+      </w:r>
+      <w:proofErr w:type="spellEnd"/>
+      <w:r>
+        <w:t xml:space="preserve"> -p ~/</w:t>
       </w:r>
       <w:r>
         <w:t>apps</w:t>
@@ -340,8 +454,13 @@
         </w:numPr>
         <w:ind w:left="1080"/>
       </w:pPr>
-      <w:r>
-        <w:t xml:space="preserve">wget </w:t>
+      <w:proofErr w:type="spellStart"/>
+      <w:r>
+        <w:t>wget</w:t>
+      </w:r>
+      <w:proofErr w:type="spellEnd"/>
+      <w:r>
+        <w:t xml:space="preserve"> </w:t>
       </w:r>
       <w:hyperlink r:id="rId6" w:history="1">
         <w:r>
@@ -357,6 +476,7 @@
         <w:ind w:left="360"/>
       </w:pPr>
       <w:r>
+        <w:lastRenderedPageBreak/>
         <w:t xml:space="preserve">      extract</w:t>
       </w:r>
     </w:p>
@@ -370,8 +490,15 @@
         <w:ind w:left="1440"/>
       </w:pPr>
       <w:r>
-        <w:lastRenderedPageBreak/>
-        <w:t>tar -xzf spark-4.1.2-bin-hadoop3.tgz</w:t>
+        <w:t>tar -</w:t>
+      </w:r>
+      <w:proofErr w:type="spellStart"/>
+      <w:r>
+        <w:t>xzf</w:t>
+      </w:r>
+      <w:proofErr w:type="spellEnd"/>
+      <w:r>
+        <w:t xml:space="preserve"> spark-4.1.2-bin-hadoop3.tgz</w:t>
       </w:r>
       <w:r>
         <w:br/>
@@ -389,10 +516,23 @@
         <w:t xml:space="preserve">         </w:t>
       </w:r>
       <w:r>
-        <w:t>nano ~/.bashrc</w:t>
-      </w:r>
-      <w:r>
-        <w:t xml:space="preserve">  , this will open file to add below </w:t>
+        <w:t>nano ~</w:t>
+      </w:r>
+      <w:proofErr w:type="gramStart"/>
+      <w:r>
+        <w:t>/.</w:t>
+      </w:r>
+      <w:proofErr w:type="spellStart"/>
+      <w:r>
+        <w:t>bashrc</w:t>
+      </w:r>
+      <w:proofErr w:type="spellEnd"/>
+      <w:r>
+        <w:t xml:space="preserve">  ,</w:t>
+      </w:r>
+      <w:proofErr w:type="gramEnd"/>
+      <w:r>
+        <w:t xml:space="preserve"> this will open file to add below </w:t>
       </w:r>
     </w:p>
     <w:p>
@@ -404,7 +544,23 @@
         </w:numPr>
       </w:pPr>
       <w:r>
-        <w:t>export JAVA_HOME=/usr/lib/jvm/java-17-openjdk-amd64</w:t>
+        <w:t>export JAVA_HOME=/</w:t>
+      </w:r>
+      <w:proofErr w:type="spellStart"/>
+      <w:r>
+        <w:t>usr</w:t>
+      </w:r>
+      <w:proofErr w:type="spellEnd"/>
+      <w:r>
+        <w:t>/lib/</w:t>
+      </w:r>
+      <w:proofErr w:type="spellStart"/>
+      <w:r>
+        <w:t>jvm</w:t>
+      </w:r>
+      <w:proofErr w:type="spellEnd"/>
+      <w:r>
+        <w:t>/java-17-openjdk-amd64</w:t>
       </w:r>
     </w:p>
     <w:p>
@@ -428,7 +584,36 @@
         </w:numPr>
       </w:pPr>
       <w:r>
-        <w:t>export PATH=$JAVA_HOME/bin:$SPARK_HOME/bin:$SPARK_HOME/sbin:$PATH</w:t>
+        <w:t>export PATH=$JAVA_HOME/</w:t>
+      </w:r>
+      <w:proofErr w:type="gramStart"/>
+      <w:r>
+        <w:t>bin:$</w:t>
+      </w:r>
+      <w:proofErr w:type="gramEnd"/>
+      <w:r>
+        <w:t>SPARK_HOME/</w:t>
+      </w:r>
+      <w:proofErr w:type="gramStart"/>
+      <w:r>
+        <w:t>bin:$</w:t>
+      </w:r>
+      <w:proofErr w:type="gramEnd"/>
+      <w:r>
+        <w:t>SPARK_HOME/</w:t>
+      </w:r>
+      <w:proofErr w:type="spellStart"/>
+      <w:proofErr w:type="gramStart"/>
+      <w:r>
+        <w:t>sbin</w:t>
+      </w:r>
+      <w:proofErr w:type="spellEnd"/>
+      <w:r>
+        <w:t>:$</w:t>
+      </w:r>
+      <w:proofErr w:type="gramEnd"/>
+      <w:r>
+        <w:t>PATH</w:t>
       </w:r>
     </w:p>
     <w:p>
@@ -436,8 +621,18 @@
         <w:ind w:left="1080"/>
       </w:pPr>
       <w:r>
-        <w:t>source ~/.bashrc</w:t>
-      </w:r>
+        <w:t>source ~</w:t>
+      </w:r>
+      <w:proofErr w:type="gramStart"/>
+      <w:r>
+        <w:t>/.</w:t>
+      </w:r>
+      <w:proofErr w:type="spellStart"/>
+      <w:r>
+        <w:t>bashrc</w:t>
+      </w:r>
+      <w:proofErr w:type="spellEnd"/>
+      <w:proofErr w:type="gramEnd"/>
       <w:r>
         <w:t xml:space="preserve"> , load the file again.</w:t>
       </w:r>
@@ -484,7 +679,20 @@
     </w:p>
     <w:p>
       <w:r>
-        <w:t>Both from Microsoft store(VSCode + Docker)</w:t>
+        <w:t xml:space="preserve">Both from Microsoft </w:t>
+      </w:r>
+      <w:proofErr w:type="gramStart"/>
+      <w:r>
+        <w:t>store(</w:t>
+      </w:r>
+      <w:proofErr w:type="spellStart"/>
+      <w:proofErr w:type="gramEnd"/>
+      <w:r>
+        <w:t>VSCode</w:t>
+      </w:r>
+      <w:proofErr w:type="spellEnd"/>
+      <w:r>
+        <w:t xml:space="preserve"> + Docker)</w:t>
       </w:r>
     </w:p>
     <w:p>
@@ -495,7 +703,15 @@
         <w:t>VS Code</w:t>
       </w:r>
       <w:r>
-        <w:t xml:space="preserve"> + WSL Integration(just click on connect with WSL)</w:t>
+        <w:t xml:space="preserve"> + WSL </w:t>
+      </w:r>
+      <w:proofErr w:type="gramStart"/>
+      <w:r>
+        <w:t>Integration(</w:t>
+      </w:r>
+      <w:proofErr w:type="gramEnd"/>
+      <w:r>
+        <w:t>just click on connect with WSL)</w:t>
       </w:r>
     </w:p>
     <w:p>
@@ -503,19 +719,40 @@
         <w:t xml:space="preserve">Extension: </w:t>
       </w:r>
       <w:r>
-        <w:t>Jupyter + PyLance</w:t>
-      </w:r>
-      <w:r>
-        <w:t xml:space="preserve"> + Python</w:t>
+        <w:t xml:space="preserve">Jupyter + </w:t>
+      </w:r>
+      <w:proofErr w:type="spellStart"/>
+      <w:r>
+        <w:t>PyLance</w:t>
+      </w:r>
+      <w:proofErr w:type="spellEnd"/>
+      <w:r>
+        <w:t xml:space="preserve"> + </w:t>
+      </w:r>
+      <w:proofErr w:type="gramStart"/>
+      <w:r>
+        <w:t>Python</w:t>
       </w:r>
       <w:r>
         <w:t xml:space="preserve"> </w:t>
       </w:r>
       <w:r>
-        <w:t>, SQLite</w:t>
-      </w:r>
-      <w:r>
-        <w:t xml:space="preserve"> – all in when wsl enabled so that it will install in ubuntu rather than windows.</w:t>
+        <w:t>,</w:t>
+      </w:r>
+      <w:proofErr w:type="gramEnd"/>
+      <w:r>
+        <w:t xml:space="preserve"> SQLite</w:t>
+      </w:r>
+      <w:r>
+        <w:t xml:space="preserve"> – all in when </w:t>
+      </w:r>
+      <w:proofErr w:type="spellStart"/>
+      <w:r>
+        <w:t>wsl</w:t>
+      </w:r>
+      <w:proofErr w:type="spellEnd"/>
+      <w:r>
+        <w:t xml:space="preserve"> enabled so that it will install in ubuntu rather than windows.</w:t>
       </w:r>
     </w:p>
     <w:p>
@@ -624,7 +861,15 @@
         <w:ind w:left="1440"/>
       </w:pPr>
       <w:r>
-        <w:t>Apply &amp; Restart.</w:t>
+        <w:t xml:space="preserve">Apply &amp; </w:t>
+      </w:r>
+      <w:proofErr w:type="gramStart"/>
+      <w:r>
+        <w:t>Restart</w:t>
+      </w:r>
+      <w:proofErr w:type="gramEnd"/>
+      <w:r>
+        <w:t>.</w:t>
       </w:r>
     </w:p>
     <w:p>
@@ -1344,7 +1589,7 @@
   <w:abstractNum w:abstractNumId="6" w15:restartNumberingAfterBreak="0">
     <w:nsid w:val="77710CAC"/>
     <w:multiLevelType w:val="hybridMultilevel"/>
-    <w:tmpl w:val="8E480D0E"/>
+    <w:tmpl w:val="B3C2A178"/>
     <w:lvl w:ilvl="0" w:tplc="40090001">
       <w:start w:val="1"/>
       <w:numFmt w:val="bullet"/>

</xml_diff>

<commit_message>
downgraded spark 4.1.2 to 3.5.6
</commit_message>
<xml_diff>
--- a/project_documents/setup/env setup guide.docx
+++ b/project_documents/setup/env setup guide.docx
@@ -96,15 +96,7 @@
         <w:t>,</w:t>
       </w:r>
       <w:r>
-        <w:t xml:space="preserve"> it will install </w:t>
-      </w:r>
-      <w:proofErr w:type="spellStart"/>
-      <w:r>
-        <w:t>wsl</w:t>
-      </w:r>
-      <w:proofErr w:type="spellEnd"/>
-      <w:r>
-        <w:t xml:space="preserve"> along with default ubuntu</w:t>
+        <w:t xml:space="preserve"> it will install wsl along with default ubuntu</w:t>
       </w:r>
     </w:p>
     <w:p>
@@ -116,24 +108,11 @@
         </w:numPr>
         <w:ind w:left="1800"/>
       </w:pPr>
-      <w:proofErr w:type="spellStart"/>
-      <w:r>
-        <w:t>wsl</w:t>
-      </w:r>
-      <w:proofErr w:type="spellEnd"/>
-      <w:r>
-        <w:t xml:space="preserve"> -l -</w:t>
-      </w:r>
-      <w:proofErr w:type="gramStart"/>
-      <w:r>
-        <w:t>v</w:t>
-      </w:r>
-      <w:r>
-        <w:t xml:space="preserve"> ,</w:t>
-      </w:r>
-      <w:proofErr w:type="gramEnd"/>
-      <w:r>
-        <w:t xml:space="preserve"> whether wsl2 installed or not.</w:t>
+      <w:r>
+        <w:t>wsl -l -v</w:t>
+      </w:r>
+      <w:r>
+        <w:t xml:space="preserve"> , whether wsl2 installed or not.</w:t>
       </w:r>
     </w:p>
     <w:p>
@@ -146,34 +125,13 @@
         <w:ind w:left="1800"/>
       </w:pPr>
       <w:r>
-        <w:t xml:space="preserve">in Ubuntu </w:t>
-      </w:r>
-      <w:proofErr w:type="gramStart"/>
-      <w:r>
-        <w:t>Terminal  :</w:t>
-      </w:r>
-      <w:proofErr w:type="gramEnd"/>
-      <w:r>
-        <w:t xml:space="preserve"> </w:t>
-      </w:r>
-      <w:proofErr w:type="spellStart"/>
-      <w:r>
-        <w:t>lsb_release</w:t>
-      </w:r>
-      <w:proofErr w:type="spellEnd"/>
-      <w:r>
-        <w:t xml:space="preserve"> -</w:t>
-      </w:r>
-      <w:proofErr w:type="gramStart"/>
-      <w:r>
-        <w:t>a</w:t>
-      </w:r>
-      <w:r>
-        <w:t xml:space="preserve">  ,</w:t>
-      </w:r>
-      <w:proofErr w:type="gramEnd"/>
-      <w:r>
-        <w:t xml:space="preserve"> details which Ubuntu version is running.</w:t>
+        <w:t xml:space="preserve">in Ubuntu Terminal  : </w:t>
+      </w:r>
+      <w:r>
+        <w:t>lsb_release -a</w:t>
+      </w:r>
+      <w:r>
+        <w:t xml:space="preserve">  , details which Ubuntu version is running.</w:t>
       </w:r>
     </w:p>
     <w:p>
@@ -221,11 +179,9 @@
       <w:r>
         <w:t xml:space="preserve"> + </w:t>
       </w:r>
-      <w:proofErr w:type="spellStart"/>
       <w:r>
         <w:t>uv</w:t>
       </w:r>
-      <w:proofErr w:type="spellEnd"/>
       <w:r>
         <w:t xml:space="preserve"> </w:t>
       </w:r>
@@ -251,21 +207,8 @@
         </w:numPr>
       </w:pPr>
       <w:r>
-        <w:t>curl -</w:t>
-      </w:r>
-      <w:proofErr w:type="spellStart"/>
-      <w:r>
-        <w:t>LsSf</w:t>
-      </w:r>
-      <w:proofErr w:type="spellEnd"/>
-      <w:r>
-        <w:t xml:space="preserve"> https://astral.sh/uv/install.sh | </w:t>
-      </w:r>
-      <w:proofErr w:type="spellStart"/>
-      <w:r>
-        <w:t>sh</w:t>
-      </w:r>
-      <w:proofErr w:type="spellEnd"/>
+        <w:t>curl -LsSf https://astral.sh/uv/install.sh | sh</w:t>
+      </w:r>
     </w:p>
     <w:p>
       <w:pPr>
@@ -276,18 +219,8 @@
         </w:numPr>
       </w:pPr>
       <w:r>
-        <w:t>source ~</w:t>
-      </w:r>
-      <w:proofErr w:type="gramStart"/>
-      <w:r>
-        <w:t>/.</w:t>
-      </w:r>
-      <w:proofErr w:type="spellStart"/>
-      <w:r>
-        <w:t>bashrc</w:t>
-      </w:r>
-      <w:proofErr w:type="spellEnd"/>
-      <w:proofErr w:type="gramEnd"/>
+        <w:t>source ~/.bashrc</w:t>
+      </w:r>
     </w:p>
     <w:p>
       <w:pPr>
@@ -297,13 +230,8 @@
           <w:numId w:val="3"/>
         </w:numPr>
       </w:pPr>
-      <w:proofErr w:type="spellStart"/>
-      <w:r>
-        <w:t>uv</w:t>
-      </w:r>
-      <w:proofErr w:type="spellEnd"/>
-      <w:r>
-        <w:t xml:space="preserve"> </w:t>
+      <w:r>
+        <w:t xml:space="preserve">uv </w:t>
       </w:r>
       <w:r>
         <w:t>–</w:t>
@@ -325,37 +253,17 @@
         <w:pStyle w:val="ListParagraph"/>
         <w:ind w:left="1440"/>
       </w:pPr>
-      <w:proofErr w:type="spellStart"/>
-      <w:r>
-        <w:t>uv</w:t>
-      </w:r>
-      <w:proofErr w:type="spellEnd"/>
-      <w:r>
-        <w:t xml:space="preserve"> </w:t>
-      </w:r>
-      <w:proofErr w:type="spellStart"/>
-      <w:r>
-        <w:t>venv</w:t>
-      </w:r>
-      <w:proofErr w:type="spellEnd"/>
+      <w:r>
+        <w:t>uv venv</w:t>
+      </w:r>
     </w:p>
     <w:p>
       <w:pPr>
         <w:pStyle w:val="ListParagraph"/>
         <w:ind w:left="1440"/>
       </w:pPr>
-      <w:proofErr w:type="gramStart"/>
-      <w:r>
-        <w:t>source .</w:t>
-      </w:r>
-      <w:proofErr w:type="spellStart"/>
-      <w:r>
-        <w:t>venv</w:t>
-      </w:r>
-      <w:proofErr w:type="spellEnd"/>
-      <w:proofErr w:type="gramEnd"/>
-      <w:r>
-        <w:t>/bin/activate</w:t>
+      <w:r>
+        <w:t>source .venv/bin/activate</w:t>
       </w:r>
     </w:p>
     <w:p>
@@ -371,13 +279,8 @@
       <w:pPr>
         <w:ind w:firstLine="720"/>
       </w:pPr>
-      <w:proofErr w:type="spellStart"/>
-      <w:r>
-        <w:t>sudo</w:t>
-      </w:r>
-      <w:proofErr w:type="spellEnd"/>
-      <w:r>
-        <w:t xml:space="preserve"> apt install openjdk-17-jdk -y</w:t>
+      <w:r>
+        <w:t>sudo apt install openjdk-17-jdk -y</w:t>
       </w:r>
     </w:p>
     <w:p>
@@ -391,6 +294,18 @@
       <w:r>
         <w:t xml:space="preserve"> 4.1.2</w:t>
       </w:r>
+      <w:r>
+        <w:t xml:space="preserve"> </w:t>
+      </w:r>
+      <w:r>
+        <w:t>(don't install</w:t>
+      </w:r>
+      <w:r>
+        <w:t xml:space="preserve"> computability issues</w:t>
+      </w:r>
+      <w:r>
+        <w:t>) go for 3.5.6</w:t>
+      </w:r>
     </w:p>
     <w:p>
       <w:pPr>
@@ -409,13 +324,8 @@
         </w:numPr>
         <w:ind w:left="1080"/>
       </w:pPr>
-      <w:proofErr w:type="spellStart"/>
-      <w:r>
-        <w:t>mkdir</w:t>
-      </w:r>
-      <w:proofErr w:type="spellEnd"/>
-      <w:r>
-        <w:t xml:space="preserve"> -p ~/</w:t>
+      <w:r>
+        <w:t>mkdir -p ~/</w:t>
       </w:r>
       <w:r>
         <w:t>apps</w:t>
@@ -439,9 +349,272 @@
     </w:p>
     <w:p>
       <w:pPr>
+        <w:pStyle w:val="ListParagraph"/>
+        <w:numPr>
+          <w:ilvl w:val="0"/>
+          <w:numId w:val="3"/>
+        </w:numPr>
+        <w:shd w:val="clear" w:color="auto" w:fill="121314"/>
+        <w:spacing w:after="0" w:line="285" w:lineRule="atLeast"/>
+        <w:rPr>
+          <w:rFonts w:ascii="Consolas" w:eastAsia="Times New Roman" w:hAnsi="Consolas" w:cs="Times New Roman"/>
+          <w:color w:val="BBBEBF"/>
+          <w:kern w:val="0"/>
+          <w:sz w:val="21"/>
+          <w:szCs w:val="21"/>
+          <w:lang w:eastAsia="en-IN"/>
+          <w14:ligatures w14:val="none"/>
+        </w:rPr>
+      </w:pPr>
+      <w:r>
+        <w:rPr>
+          <w:rFonts w:ascii="Consolas" w:eastAsia="Times New Roman" w:hAnsi="Consolas" w:cs="Times New Roman"/>
+          <w:color w:val="BBBEBF"/>
+          <w:kern w:val="0"/>
+          <w:sz w:val="21"/>
+          <w:szCs w:val="21"/>
+          <w:lang w:eastAsia="en-IN"/>
+          <w14:ligatures w14:val="none"/>
+        </w:rPr>
+        <w:t>Remove if Spark 4.1.2 (installed) otherwise skip</w:t>
+      </w:r>
+    </w:p>
+    <w:p>
+      <w:pPr>
+        <w:pStyle w:val="ListParagraph"/>
+        <w:numPr>
+          <w:ilvl w:val="0"/>
+          <w:numId w:val="3"/>
+        </w:numPr>
+        <w:shd w:val="clear" w:color="auto" w:fill="121314"/>
+        <w:spacing w:after="0" w:line="285" w:lineRule="atLeast"/>
+        <w:rPr>
+          <w:rFonts w:ascii="Consolas" w:eastAsia="Times New Roman" w:hAnsi="Consolas" w:cs="Times New Roman"/>
+          <w:color w:val="BBBEBF"/>
+          <w:kern w:val="0"/>
+          <w:sz w:val="21"/>
+          <w:szCs w:val="21"/>
+          <w:lang w:eastAsia="en-IN"/>
+          <w14:ligatures w14:val="none"/>
+        </w:rPr>
+      </w:pPr>
+      <w:r>
+        <w:rPr>
+          <w:rFonts w:ascii="Consolas" w:eastAsia="Times New Roman" w:hAnsi="Consolas" w:cs="Times New Roman"/>
+          <w:color w:val="BBBEBF"/>
+          <w:kern w:val="0"/>
+          <w:sz w:val="21"/>
+          <w:szCs w:val="21"/>
+          <w:lang w:eastAsia="en-IN"/>
+          <w14:ligatures w14:val="none"/>
+        </w:rPr>
+        <w:t>```bash</w:t>
+      </w:r>
+    </w:p>
+    <w:p>
+      <w:pPr>
+        <w:pStyle w:val="ListParagraph"/>
+        <w:numPr>
+          <w:ilvl w:val="0"/>
+          <w:numId w:val="3"/>
+        </w:numPr>
+        <w:shd w:val="clear" w:color="auto" w:fill="121314"/>
+        <w:spacing w:after="0" w:line="285" w:lineRule="atLeast"/>
+        <w:rPr>
+          <w:rFonts w:ascii="Consolas" w:eastAsia="Times New Roman" w:hAnsi="Consolas" w:cs="Times New Roman"/>
+          <w:color w:val="BBBEBF"/>
+          <w:kern w:val="0"/>
+          <w:sz w:val="21"/>
+          <w:szCs w:val="21"/>
+          <w:lang w:eastAsia="en-IN"/>
+          <w14:ligatures w14:val="none"/>
+        </w:rPr>
+      </w:pPr>
+      <w:r>
+        <w:rPr>
+          <w:rFonts w:ascii="Consolas" w:eastAsia="Times New Roman" w:hAnsi="Consolas" w:cs="Times New Roman"/>
+          <w:color w:val="FFA657"/>
+          <w:kern w:val="0"/>
+          <w:sz w:val="21"/>
+          <w:szCs w:val="21"/>
+          <w:lang w:eastAsia="en-IN"/>
+          <w14:ligatures w14:val="none"/>
+        </w:rPr>
+        <w:t>rm</w:t>
+      </w:r>
+      <w:r>
+        <w:rPr>
+          <w:rFonts w:ascii="Consolas" w:eastAsia="Times New Roman" w:hAnsi="Consolas" w:cs="Times New Roman"/>
+          <w:color w:val="D4D4D4"/>
+          <w:kern w:val="0"/>
+          <w:sz w:val="21"/>
+          <w:szCs w:val="21"/>
+          <w:lang w:eastAsia="en-IN"/>
+          <w14:ligatures w14:val="none"/>
+        </w:rPr>
+        <w:t xml:space="preserve"> </w:t>
+      </w:r>
+      <w:r>
+        <w:rPr>
+          <w:rFonts w:ascii="Consolas" w:eastAsia="Times New Roman" w:hAnsi="Consolas" w:cs="Times New Roman"/>
+          <w:color w:val="569CD6"/>
+          <w:kern w:val="0"/>
+          <w:sz w:val="21"/>
+          <w:szCs w:val="21"/>
+          <w:lang w:eastAsia="en-IN"/>
+          <w14:ligatures w14:val="none"/>
+        </w:rPr>
+        <w:t>-rf</w:t>
+      </w:r>
+      <w:r>
+        <w:rPr>
+          <w:rFonts w:ascii="Consolas" w:eastAsia="Times New Roman" w:hAnsi="Consolas" w:cs="Times New Roman"/>
+          <w:color w:val="D4D4D4"/>
+          <w:kern w:val="0"/>
+          <w:sz w:val="21"/>
+          <w:szCs w:val="21"/>
+          <w:lang w:eastAsia="en-IN"/>
+          <w14:ligatures w14:val="none"/>
+        </w:rPr>
+        <w:t xml:space="preserve"> </w:t>
+      </w:r>
+      <w:r>
+        <w:rPr>
+          <w:rFonts w:ascii="Consolas" w:eastAsia="Times New Roman" w:hAnsi="Consolas" w:cs="Times New Roman"/>
+          <w:color w:val="A5D6FF"/>
+          <w:kern w:val="0"/>
+          <w:sz w:val="21"/>
+          <w:szCs w:val="21"/>
+          <w:lang w:eastAsia="en-IN"/>
+          <w14:ligatures w14:val="none"/>
+        </w:rPr>
+        <w:t>spark</w:t>
+      </w:r>
+    </w:p>
+    <w:p>
+      <w:pPr>
+        <w:pStyle w:val="ListParagraph"/>
+        <w:numPr>
+          <w:ilvl w:val="0"/>
+          <w:numId w:val="3"/>
+        </w:numPr>
+        <w:shd w:val="clear" w:color="auto" w:fill="121314"/>
+        <w:spacing w:after="0" w:line="285" w:lineRule="atLeast"/>
+        <w:rPr>
+          <w:rFonts w:ascii="Consolas" w:eastAsia="Times New Roman" w:hAnsi="Consolas" w:cs="Times New Roman"/>
+          <w:color w:val="BBBEBF"/>
+          <w:kern w:val="0"/>
+          <w:sz w:val="21"/>
+          <w:szCs w:val="21"/>
+          <w:lang w:eastAsia="en-IN"/>
+          <w14:ligatures w14:val="none"/>
+        </w:rPr>
+      </w:pPr>
+      <w:r>
+        <w:rPr>
+          <w:rFonts w:ascii="Consolas" w:eastAsia="Times New Roman" w:hAnsi="Consolas" w:cs="Times New Roman"/>
+          <w:color w:val="FFA657"/>
+          <w:kern w:val="0"/>
+          <w:sz w:val="21"/>
+          <w:szCs w:val="21"/>
+          <w:lang w:eastAsia="en-IN"/>
+          <w14:ligatures w14:val="none"/>
+        </w:rPr>
+        <w:t>rm</w:t>
+      </w:r>
+      <w:r>
+        <w:rPr>
+          <w:rFonts w:ascii="Consolas" w:eastAsia="Times New Roman" w:hAnsi="Consolas" w:cs="Times New Roman"/>
+          <w:color w:val="D4D4D4"/>
+          <w:kern w:val="0"/>
+          <w:sz w:val="21"/>
+          <w:szCs w:val="21"/>
+          <w:lang w:eastAsia="en-IN"/>
+          <w14:ligatures w14:val="none"/>
+        </w:rPr>
+        <w:t xml:space="preserve"> </w:t>
+      </w:r>
+      <w:r>
+        <w:rPr>
+          <w:rFonts w:ascii="Consolas" w:eastAsia="Times New Roman" w:hAnsi="Consolas" w:cs="Times New Roman"/>
+          <w:color w:val="569CD6"/>
+          <w:kern w:val="0"/>
+          <w:sz w:val="21"/>
+          <w:szCs w:val="21"/>
+          <w:lang w:eastAsia="en-IN"/>
+          <w14:ligatures w14:val="none"/>
+        </w:rPr>
+        <w:t>-f</w:t>
+      </w:r>
+      <w:r>
+        <w:rPr>
+          <w:rFonts w:ascii="Consolas" w:eastAsia="Times New Roman" w:hAnsi="Consolas" w:cs="Times New Roman"/>
+          <w:color w:val="D4D4D4"/>
+          <w:kern w:val="0"/>
+          <w:sz w:val="21"/>
+          <w:szCs w:val="21"/>
+          <w:lang w:eastAsia="en-IN"/>
+          <w14:ligatures w14:val="none"/>
+        </w:rPr>
+        <w:t xml:space="preserve"> </w:t>
+      </w:r>
+      <w:r>
+        <w:rPr>
+          <w:rFonts w:ascii="Consolas" w:eastAsia="Times New Roman" w:hAnsi="Consolas" w:cs="Times New Roman"/>
+          <w:color w:val="A5D6FF"/>
+          <w:kern w:val="0"/>
+          <w:sz w:val="21"/>
+          <w:szCs w:val="21"/>
+          <w:lang w:eastAsia="en-IN"/>
+          <w14:ligatures w14:val="none"/>
+        </w:rPr>
+        <w:t>spark-4.1.2-bin-hadoop3.tgz</w:t>
+      </w:r>
+    </w:p>
+    <w:p>
+      <w:pPr>
+        <w:pStyle w:val="ListParagraph"/>
+        <w:numPr>
+          <w:ilvl w:val="0"/>
+          <w:numId w:val="3"/>
+        </w:numPr>
+        <w:shd w:val="clear" w:color="auto" w:fill="121314"/>
+        <w:spacing w:after="0" w:line="285" w:lineRule="atLeast"/>
+        <w:rPr>
+          <w:rFonts w:ascii="Consolas" w:eastAsia="Times New Roman" w:hAnsi="Consolas" w:cs="Times New Roman"/>
+          <w:color w:val="BBBEBF"/>
+          <w:kern w:val="0"/>
+          <w:sz w:val="21"/>
+          <w:szCs w:val="21"/>
+          <w:lang w:eastAsia="en-IN"/>
+          <w14:ligatures w14:val="none"/>
+        </w:rPr>
+      </w:pPr>
+      <w:r>
+        <w:rPr>
+          <w:rFonts w:ascii="Consolas" w:eastAsia="Times New Roman" w:hAnsi="Consolas" w:cs="Times New Roman"/>
+          <w:color w:val="BBBEBF"/>
+          <w:kern w:val="0"/>
+          <w:sz w:val="21"/>
+          <w:szCs w:val="21"/>
+          <w:lang w:eastAsia="en-IN"/>
+          <w14:ligatures w14:val="none"/>
+        </w:rPr>
+        <w:t>```</w:t>
+      </w:r>
+    </w:p>
+    <w:p>
+      <w:pPr>
+        <w:pStyle w:val="ListParagraph"/>
+        <w:ind w:left="1080"/>
+      </w:pPr>
+    </w:p>
+    <w:p>
+      <w:pPr>
         <w:ind w:left="360"/>
       </w:pPr>
       <w:r>
+        <w:lastRenderedPageBreak/>
         <w:t xml:space="preserve">     download </w:t>
       </w:r>
     </w:p>
@@ -454,29 +627,89 @@
         </w:numPr>
         <w:ind w:left="1080"/>
       </w:pPr>
-      <w:proofErr w:type="spellStart"/>
-      <w:r>
-        <w:t>wget</w:t>
-      </w:r>
-      <w:proofErr w:type="spellEnd"/>
-      <w:r>
-        <w:t xml:space="preserve"> </w:t>
+      <w:r>
+        <w:t xml:space="preserve">wget </w:t>
       </w:r>
       <w:hyperlink r:id="rId6" w:history="1">
         <w:r>
           <w:rPr>
             <w:rStyle w:val="Hyperlink"/>
           </w:rPr>
-          <w:t>https://downloads.apache.org/spark/spark-4.1.2/spark-4.1.2-bin-hadoop3.tgz</w:t>
+          <w:t>https://downloads.apache.org/spark/spark-4.1.2/spark-4.1.2-bin-hadoop3.tgz(skip)</w:t>
         </w:r>
       </w:hyperlink>
     </w:p>
     <w:p>
       <w:pPr>
+        <w:pStyle w:val="ListParagraph"/>
+        <w:numPr>
+          <w:ilvl w:val="0"/>
+          <w:numId w:val="7"/>
+        </w:numPr>
+        <w:shd w:val="clear" w:color="auto" w:fill="121314"/>
+        <w:spacing w:after="0" w:line="285" w:lineRule="atLeast"/>
+        <w:rPr>
+          <w:rFonts w:ascii="Consolas" w:eastAsia="Times New Roman" w:hAnsi="Consolas" w:cs="Times New Roman"/>
+          <w:color w:val="BBBEBF"/>
+          <w:kern w:val="0"/>
+          <w:sz w:val="21"/>
+          <w:szCs w:val="21"/>
+          <w:lang w:eastAsia="en-IN"/>
+          <w14:ligatures w14:val="none"/>
+        </w:rPr>
+      </w:pPr>
+      <w:r>
+        <w:rPr>
+          <w:rFonts w:ascii="Consolas" w:eastAsia="Times New Roman" w:hAnsi="Consolas" w:cs="Times New Roman"/>
+          <w:color w:val="FFA657"/>
+          <w:kern w:val="0"/>
+          <w:sz w:val="21"/>
+          <w:szCs w:val="21"/>
+          <w:lang w:eastAsia="en-IN"/>
+          <w14:ligatures w14:val="none"/>
+        </w:rPr>
+        <w:t>wget</w:t>
+      </w:r>
+      <w:r>
+        <w:rPr>
+          <w:rFonts w:ascii="Consolas" w:eastAsia="Times New Roman" w:hAnsi="Consolas" w:cs="Times New Roman"/>
+          <w:color w:val="D4D4D4"/>
+          <w:kern w:val="0"/>
+          <w:sz w:val="21"/>
+          <w:szCs w:val="21"/>
+          <w:lang w:eastAsia="en-IN"/>
+          <w14:ligatures w14:val="none"/>
+        </w:rPr>
+        <w:t xml:space="preserve"> </w:t>
+      </w:r>
+      <w:r>
+        <w:rPr>
+          <w:rFonts w:ascii="Consolas" w:eastAsia="Times New Roman" w:hAnsi="Consolas" w:cs="Times New Roman"/>
+          <w:color w:val="A5D6FF"/>
+          <w:kern w:val="0"/>
+          <w:sz w:val="21"/>
+          <w:szCs w:val="21"/>
+          <w:lang w:eastAsia="en-IN"/>
+          <w14:ligatures w14:val="none"/>
+        </w:rPr>
+        <w:t>https://archive.apache.org/dist/spark/spark-3.5.6/spark-3.5.6-bin-hadoop3.tgz</w:t>
+      </w:r>
+    </w:p>
+    <w:p>
+      <w:pPr>
+        <w:pStyle w:val="ListParagraph"/>
+        <w:numPr>
+          <w:ilvl w:val="0"/>
+          <w:numId w:val="7"/>
+        </w:numPr>
+        <w:ind w:left="1080"/>
+      </w:pPr>
+    </w:p>
+    <w:p>
+      <w:pPr>
         <w:ind w:left="360"/>
       </w:pPr>
       <w:r>
-        <w:lastRenderedPageBreak/>
         <w:t xml:space="preserve">      extract</w:t>
       </w:r>
     </w:p>
@@ -490,24 +723,190 @@
         <w:ind w:left="1440"/>
       </w:pPr>
       <w:r>
-        <w:t>tar -</w:t>
-      </w:r>
-      <w:proofErr w:type="spellStart"/>
-      <w:r>
-        <w:t>xzf</w:t>
-      </w:r>
-      <w:proofErr w:type="spellEnd"/>
-      <w:r>
-        <w:t xml:space="preserve"> spark-4.1.2-bin-hadoop3.tgz</w:t>
+        <w:t>tar -xzf spark-4.1.2-bin-hadoop3.tgz</w:t>
+      </w:r>
+      <w:r>
+        <w:t xml:space="preserve"> (skip)</w:t>
       </w:r>
       <w:r>
         <w:br/>
         <w:t>mv spark-4.1.2-bin-hadoop3 spark</w:t>
       </w:r>
+      <w:r>
+        <w:t xml:space="preserve"> ( skip)</w:t>
+      </w:r>
+    </w:p>
+    <w:p>
+      <w:pPr>
+        <w:pStyle w:val="ListParagraph"/>
+        <w:numPr>
+          <w:ilvl w:val="0"/>
+          <w:numId w:val="3"/>
+        </w:numPr>
+        <w:shd w:val="clear" w:color="auto" w:fill="121314"/>
+        <w:spacing w:after="0" w:line="285" w:lineRule="atLeast"/>
+        <w:rPr>
+          <w:rFonts w:ascii="Consolas" w:eastAsia="Times New Roman" w:hAnsi="Consolas" w:cs="Times New Roman"/>
+          <w:color w:val="BBBEBF"/>
+          <w:kern w:val="0"/>
+          <w:sz w:val="21"/>
+          <w:szCs w:val="21"/>
+          <w:lang w:eastAsia="en-IN"/>
+          <w14:ligatures w14:val="none"/>
+        </w:rPr>
+      </w:pPr>
+      <w:r>
+        <w:rPr>
+          <w:rFonts w:ascii="Consolas" w:eastAsia="Times New Roman" w:hAnsi="Consolas" w:cs="Times New Roman"/>
+          <w:color w:val="FFA657"/>
+          <w:kern w:val="0"/>
+          <w:sz w:val="21"/>
+          <w:szCs w:val="21"/>
+          <w:lang w:eastAsia="en-IN"/>
+          <w14:ligatures w14:val="none"/>
+        </w:rPr>
+        <w:t>tar</w:t>
+      </w:r>
+      <w:r>
+        <w:rPr>
+          <w:rFonts w:ascii="Consolas" w:eastAsia="Times New Roman" w:hAnsi="Consolas" w:cs="Times New Roman"/>
+          <w:color w:val="D4D4D4"/>
+          <w:kern w:val="0"/>
+          <w:sz w:val="21"/>
+          <w:szCs w:val="21"/>
+          <w:lang w:eastAsia="en-IN"/>
+          <w14:ligatures w14:val="none"/>
+        </w:rPr>
+        <w:t xml:space="preserve"> </w:t>
+      </w:r>
+      <w:r>
+        <w:rPr>
+          <w:rFonts w:ascii="Consolas" w:eastAsia="Times New Roman" w:hAnsi="Consolas" w:cs="Times New Roman"/>
+          <w:color w:val="569CD6"/>
+          <w:kern w:val="0"/>
+          <w:sz w:val="21"/>
+          <w:szCs w:val="21"/>
+          <w:lang w:eastAsia="en-IN"/>
+          <w14:ligatures w14:val="none"/>
+        </w:rPr>
+        <w:t>-xzf</w:t>
+      </w:r>
+      <w:r>
+        <w:rPr>
+          <w:rFonts w:ascii="Consolas" w:eastAsia="Times New Roman" w:hAnsi="Consolas" w:cs="Times New Roman"/>
+          <w:color w:val="D4D4D4"/>
+          <w:kern w:val="0"/>
+          <w:sz w:val="21"/>
+          <w:szCs w:val="21"/>
+          <w:lang w:eastAsia="en-IN"/>
+          <w14:ligatures w14:val="none"/>
+        </w:rPr>
+        <w:t xml:space="preserve"> </w:t>
+      </w:r>
+      <w:r>
+        <w:rPr>
+          <w:rFonts w:ascii="Consolas" w:eastAsia="Times New Roman" w:hAnsi="Consolas" w:cs="Times New Roman"/>
+          <w:color w:val="A5D6FF"/>
+          <w:kern w:val="0"/>
+          <w:sz w:val="21"/>
+          <w:szCs w:val="21"/>
+          <w:lang w:eastAsia="en-IN"/>
+          <w14:ligatures w14:val="none"/>
+        </w:rPr>
+        <w:t>spark-3.5.6-bin-hadoop3.tgz</w:t>
+      </w:r>
+    </w:p>
+    <w:p>
+      <w:pPr>
+        <w:pStyle w:val="ListParagraph"/>
+        <w:numPr>
+          <w:ilvl w:val="0"/>
+          <w:numId w:val="3"/>
+        </w:numPr>
+        <w:shd w:val="clear" w:color="auto" w:fill="121314"/>
+        <w:spacing w:after="0" w:line="285" w:lineRule="atLeast"/>
+        <w:rPr>
+          <w:rFonts w:ascii="Consolas" w:eastAsia="Times New Roman" w:hAnsi="Consolas" w:cs="Times New Roman"/>
+          <w:color w:val="BBBEBF"/>
+          <w:kern w:val="0"/>
+          <w:sz w:val="21"/>
+          <w:szCs w:val="21"/>
+          <w:lang w:eastAsia="en-IN"/>
+          <w14:ligatures w14:val="none"/>
+        </w:rPr>
+      </w:pPr>
+      <w:r>
+        <w:rPr>
+          <w:rFonts w:ascii="Consolas" w:eastAsia="Times New Roman" w:hAnsi="Consolas" w:cs="Times New Roman"/>
+          <w:color w:val="FFA657"/>
+          <w:kern w:val="0"/>
+          <w:sz w:val="21"/>
+          <w:szCs w:val="21"/>
+          <w:lang w:eastAsia="en-IN"/>
+          <w14:ligatures w14:val="none"/>
+        </w:rPr>
+        <w:t>mv</w:t>
+      </w:r>
+      <w:r>
+        <w:rPr>
+          <w:rFonts w:ascii="Consolas" w:eastAsia="Times New Roman" w:hAnsi="Consolas" w:cs="Times New Roman"/>
+          <w:color w:val="D4D4D4"/>
+          <w:kern w:val="0"/>
+          <w:sz w:val="21"/>
+          <w:szCs w:val="21"/>
+          <w:lang w:eastAsia="en-IN"/>
+          <w14:ligatures w14:val="none"/>
+        </w:rPr>
+        <w:t xml:space="preserve"> </w:t>
+      </w:r>
+      <w:r>
+        <w:rPr>
+          <w:rFonts w:ascii="Consolas" w:eastAsia="Times New Roman" w:hAnsi="Consolas" w:cs="Times New Roman"/>
+          <w:color w:val="A5D6FF"/>
+          <w:kern w:val="0"/>
+          <w:sz w:val="21"/>
+          <w:szCs w:val="21"/>
+          <w:lang w:eastAsia="en-IN"/>
+          <w14:ligatures w14:val="none"/>
+        </w:rPr>
+        <w:t>spark-3.5.6-bin-hadoop3</w:t>
+      </w:r>
+      <w:r>
+        <w:rPr>
+          <w:rFonts w:ascii="Consolas" w:eastAsia="Times New Roman" w:hAnsi="Consolas" w:cs="Times New Roman"/>
+          <w:color w:val="D4D4D4"/>
+          <w:kern w:val="0"/>
+          <w:sz w:val="21"/>
+          <w:szCs w:val="21"/>
+          <w:lang w:eastAsia="en-IN"/>
+          <w14:ligatures w14:val="none"/>
+        </w:rPr>
+        <w:t xml:space="preserve"> </w:t>
+      </w:r>
+      <w:r>
+        <w:rPr>
+          <w:rFonts w:ascii="Consolas" w:eastAsia="Times New Roman" w:hAnsi="Consolas" w:cs="Times New Roman"/>
+          <w:color w:val="A5D6FF"/>
+          <w:kern w:val="0"/>
+          <w:sz w:val="21"/>
+          <w:szCs w:val="21"/>
+          <w:lang w:eastAsia="en-IN"/>
+          <w14:ligatures w14:val="none"/>
+        </w:rPr>
+        <w:t>spark</w:t>
+      </w:r>
+    </w:p>
+    <w:p>
+      <w:pPr>
+        <w:ind w:left="360"/>
+      </w:pPr>
     </w:p>
     <w:p>
       <w:r>
         <w:t xml:space="preserve">              path addition</w:t>
+      </w:r>
+      <w:r>
+        <w:t>(verify if not present then add)</w:t>
       </w:r>
     </w:p>
     <w:p>
@@ -516,23 +915,10 @@
         <w:t xml:space="preserve">         </w:t>
       </w:r>
       <w:r>
-        <w:t>nano ~</w:t>
-      </w:r>
-      <w:proofErr w:type="gramStart"/>
-      <w:r>
-        <w:t>/.</w:t>
-      </w:r>
-      <w:proofErr w:type="spellStart"/>
-      <w:r>
-        <w:t>bashrc</w:t>
-      </w:r>
-      <w:proofErr w:type="spellEnd"/>
-      <w:r>
-        <w:t xml:space="preserve">  ,</w:t>
-      </w:r>
-      <w:proofErr w:type="gramEnd"/>
-      <w:r>
-        <w:t xml:space="preserve"> this will open file to add below </w:t>
+        <w:t>nano ~/.bashrc</w:t>
+      </w:r>
+      <w:r>
+        <w:t xml:space="preserve">  , this will open file to add below </w:t>
       </w:r>
     </w:p>
     <w:p>
@@ -544,23 +930,7 @@
         </w:numPr>
       </w:pPr>
       <w:r>
-        <w:t>export JAVA_HOME=/</w:t>
-      </w:r>
-      <w:proofErr w:type="spellStart"/>
-      <w:r>
-        <w:t>usr</w:t>
-      </w:r>
-      <w:proofErr w:type="spellEnd"/>
-      <w:r>
-        <w:t>/lib/</w:t>
-      </w:r>
-      <w:proofErr w:type="spellStart"/>
-      <w:r>
-        <w:t>jvm</w:t>
-      </w:r>
-      <w:proofErr w:type="spellEnd"/>
-      <w:r>
-        <w:t>/java-17-openjdk-amd64</w:t>
+        <w:t>export JAVA_HOME=/usr/lib/jvm/java-17-openjdk-amd64</w:t>
       </w:r>
     </w:p>
     <w:p>
@@ -584,36 +954,7 @@
         </w:numPr>
       </w:pPr>
       <w:r>
-        <w:t>export PATH=$JAVA_HOME/</w:t>
-      </w:r>
-      <w:proofErr w:type="gramStart"/>
-      <w:r>
-        <w:t>bin:$</w:t>
-      </w:r>
-      <w:proofErr w:type="gramEnd"/>
-      <w:r>
-        <w:t>SPARK_HOME/</w:t>
-      </w:r>
-      <w:proofErr w:type="gramStart"/>
-      <w:r>
-        <w:t>bin:$</w:t>
-      </w:r>
-      <w:proofErr w:type="gramEnd"/>
-      <w:r>
-        <w:t>SPARK_HOME/</w:t>
-      </w:r>
-      <w:proofErr w:type="spellStart"/>
-      <w:proofErr w:type="gramStart"/>
-      <w:r>
-        <w:t>sbin</w:t>
-      </w:r>
-      <w:proofErr w:type="spellEnd"/>
-      <w:r>
-        <w:t>:$</w:t>
-      </w:r>
-      <w:proofErr w:type="gramEnd"/>
-      <w:r>
-        <w:t>PATH</w:t>
+        <w:t>export PATH=$JAVA_HOME/bin:$SPARK_HOME/bin:$SPARK_HOME/sbin:$PATH</w:t>
       </w:r>
     </w:p>
     <w:p>
@@ -621,18 +962,8 @@
         <w:ind w:left="1080"/>
       </w:pPr>
       <w:r>
-        <w:t>source ~</w:t>
-      </w:r>
-      <w:proofErr w:type="gramStart"/>
-      <w:r>
-        <w:t>/.</w:t>
-      </w:r>
-      <w:proofErr w:type="spellStart"/>
-      <w:r>
-        <w:t>bashrc</w:t>
-      </w:r>
-      <w:proofErr w:type="spellEnd"/>
-      <w:proofErr w:type="gramEnd"/>
+        <w:t>source ~/.bashrc</w:t>
+      </w:r>
       <w:r>
         <w:t xml:space="preserve"> , load the file again.</w:t>
       </w:r>
@@ -679,20 +1010,7 @@
     </w:p>
     <w:p>
       <w:r>
-        <w:t xml:space="preserve">Both from Microsoft </w:t>
-      </w:r>
-      <w:proofErr w:type="gramStart"/>
-      <w:r>
-        <w:t>store(</w:t>
-      </w:r>
-      <w:proofErr w:type="spellStart"/>
-      <w:proofErr w:type="gramEnd"/>
-      <w:r>
-        <w:t>VSCode</w:t>
-      </w:r>
-      <w:proofErr w:type="spellEnd"/>
-      <w:r>
-        <w:t xml:space="preserve"> + Docker)</w:t>
+        <w:t>Both from Microsoft store(VSCode + Docker)</w:t>
       </w:r>
     </w:p>
     <w:p>
@@ -703,15 +1021,7 @@
         <w:t>VS Code</w:t>
       </w:r>
       <w:r>
-        <w:t xml:space="preserve"> + WSL </w:t>
-      </w:r>
-      <w:proofErr w:type="gramStart"/>
-      <w:r>
-        <w:t>Integration(</w:t>
-      </w:r>
-      <w:proofErr w:type="gramEnd"/>
-      <w:r>
-        <w:t>just click on connect with WSL)</w:t>
+        <w:t xml:space="preserve"> + WSL Integration(just click on connect with WSL)</w:t>
       </w:r>
     </w:p>
     <w:p>
@@ -719,40 +1029,19 @@
         <w:t xml:space="preserve">Extension: </w:t>
       </w:r>
       <w:r>
-        <w:t xml:space="preserve">Jupyter + </w:t>
-      </w:r>
-      <w:proofErr w:type="spellStart"/>
-      <w:r>
-        <w:t>PyLance</w:t>
-      </w:r>
-      <w:proofErr w:type="spellEnd"/>
-      <w:r>
-        <w:t xml:space="preserve"> + </w:t>
-      </w:r>
-      <w:proofErr w:type="gramStart"/>
-      <w:r>
-        <w:t>Python</w:t>
+        <w:t>Jupyter + PyLance</w:t>
+      </w:r>
+      <w:r>
+        <w:t xml:space="preserve"> + Python</w:t>
       </w:r>
       <w:r>
         <w:t xml:space="preserve"> </w:t>
       </w:r>
       <w:r>
-        <w:t>,</w:t>
-      </w:r>
-      <w:proofErr w:type="gramEnd"/>
-      <w:r>
-        <w:t xml:space="preserve"> SQLite</w:t>
-      </w:r>
-      <w:r>
-        <w:t xml:space="preserve"> – all in when </w:t>
-      </w:r>
-      <w:proofErr w:type="spellStart"/>
-      <w:r>
-        <w:t>wsl</w:t>
-      </w:r>
-      <w:proofErr w:type="spellEnd"/>
-      <w:r>
-        <w:t xml:space="preserve"> enabled so that it will install in ubuntu rather than windows.</w:t>
+        <w:t>, SQLite</w:t>
+      </w:r>
+      <w:r>
+        <w:t xml:space="preserve"> – all in when wsl enabled so that it will install in ubuntu rather than windows.</w:t>
       </w:r>
     </w:p>
     <w:p>
@@ -861,15 +1150,8 @@
         <w:ind w:left="1440"/>
       </w:pPr>
       <w:r>
-        <w:t xml:space="preserve">Apply &amp; </w:t>
-      </w:r>
-      <w:proofErr w:type="gramStart"/>
-      <w:r>
-        <w:t>Restart</w:t>
-      </w:r>
-      <w:proofErr w:type="gramEnd"/>
-      <w:r>
-        <w:t>.</w:t>
+        <w:lastRenderedPageBreak/>
+        <w:t>Apply &amp; Restart.</w:t>
       </w:r>
     </w:p>
     <w:p>
@@ -2323,7 +2605,6 @@
   <w:style w:type="character" w:default="1" w:styleId="DefaultParagraphFont">
     <w:name w:val="Default Paragraph Font"/>
     <w:uiPriority w:val="1"/>
-    <w:semiHidden/>
     <w:unhideWhenUsed/>
   </w:style>
   <w:style w:type="table" w:default="1" w:styleId="TableNormal">

</xml_diff>